<commit_message>
La fiche produit avait le même défaut d'unité
`ImageRun.transformation` compte en pixels à 96 dpi : les téléphones annoncés
à 31 mm sortaient à 23,3, le code d'installation à 16,5 au lieu de 22.

La fiche n'avait plus deux millimètres — 777 pt de contenu pour 779. Rendre
aux images leur taille demandait de la place : elle est prise sur le bas des
écrans, qui ne porte rien ici (les cinq se lisent par le haut), pas sur leur
largeur, qui est ce qui les rend lisibles. Le bandeau passe donc par `cadrer()`
plutôt que par les PNG entiers de `encadrees/` — même bezel, un cache de moins
à tenir à jour, et le repli local d'`img()` disparaît, inemployé depuis le
2 septembre.

Toujours une page, 2,5 mm de reste. Code décodé à 600 dpi depuis le PDF final.
Plus aucun `2.8346` dans le dépôt.

Aucun deck régénéré.

Co-Authored-By: Claude Opus 5 <noreply@anthropic.com>
</commit_message>
<xml_diff>
--- a/docs/entreprise/fiche-produit/Quantinvo-fiche-produit.docx
+++ b/docs/entreprise/fiche-produit/Quantinvo-fiche-produit.docx
@@ -549,7 +549,7 @@
             <w:r>
               <w:drawing>
                 <wp:inline distT="0" distB="0" distL="0" distR="0">
-                  <wp:extent cx="836987" cy="1768472"/>
+                  <wp:extent cx="1116000" cy="1512000"/>
                   <wp:effectExtent t="0" r="0" b="0" l="0"/>
                   <wp:docPr id="1" name="" descr="" title=""/>
                   <wp:cNvGraphicFramePr>
@@ -574,7 +574,7 @@
                         <pic:spPr bwMode="auto">
                           <a:xfrm>
                             <a:off x="0" y="0"/>
-                            <a:ext cx="836987" cy="1768472"/>
+                            <a:ext cx="1116000" cy="1512000"/>
                           </a:xfrm>
                           <a:prstGeom prst="rect">
                             <a:avLst/>
@@ -622,7 +622,7 @@
             <w:r>
               <w:drawing>
                 <wp:inline distT="0" distB="0" distL="0" distR="0">
-                  <wp:extent cx="836987" cy="1768472"/>
+                  <wp:extent cx="1116000" cy="1512000"/>
                   <wp:effectExtent t="0" r="0" b="0" l="0"/>
                   <wp:docPr id="1" name="" descr="" title=""/>
                   <wp:cNvGraphicFramePr>
@@ -647,7 +647,7 @@
                         <pic:spPr bwMode="auto">
                           <a:xfrm>
                             <a:off x="0" y="0"/>
-                            <a:ext cx="836987" cy="1768472"/>
+                            <a:ext cx="1116000" cy="1512000"/>
                           </a:xfrm>
                           <a:prstGeom prst="rect">
                             <a:avLst/>
@@ -695,7 +695,7 @@
             <w:r>
               <w:drawing>
                 <wp:inline distT="0" distB="0" distL="0" distR="0">
-                  <wp:extent cx="836987" cy="1768472"/>
+                  <wp:extent cx="1116000" cy="1512000"/>
                   <wp:effectExtent t="0" r="0" b="0" l="0"/>
                   <wp:docPr id="1" name="" descr="" title=""/>
                   <wp:cNvGraphicFramePr>
@@ -720,7 +720,7 @@
                         <pic:spPr bwMode="auto">
                           <a:xfrm>
                             <a:off x="0" y="0"/>
-                            <a:ext cx="836987" cy="1768472"/>
+                            <a:ext cx="1116000" cy="1512000"/>
                           </a:xfrm>
                           <a:prstGeom prst="rect">
                             <a:avLst/>
@@ -768,7 +768,7 @@
             <w:r>
               <w:drawing>
                 <wp:inline distT="0" distB="0" distL="0" distR="0">
-                  <wp:extent cx="836987" cy="1768472"/>
+                  <wp:extent cx="1116000" cy="1512000"/>
                   <wp:effectExtent t="0" r="0" b="0" l="0"/>
                   <wp:docPr id="1" name="" descr="" title=""/>
                   <wp:cNvGraphicFramePr>
@@ -793,7 +793,7 @@
                         <pic:spPr bwMode="auto">
                           <a:xfrm>
                             <a:off x="0" y="0"/>
-                            <a:ext cx="836987" cy="1768472"/>
+                            <a:ext cx="1116000" cy="1512000"/>
                           </a:xfrm>
                           <a:prstGeom prst="rect">
                             <a:avLst/>
@@ -841,7 +841,7 @@
             <w:r>
               <w:drawing>
                 <wp:inline distT="0" distB="0" distL="0" distR="0">
-                  <wp:extent cx="836987" cy="1768472"/>
+                  <wp:extent cx="1116000" cy="1512000"/>
                   <wp:effectExtent t="0" r="0" b="0" l="0"/>
                   <wp:docPr id="1" name="" descr="" title=""/>
                   <wp:cNvGraphicFramePr>
@@ -866,7 +866,7 @@
                         <pic:spPr bwMode="auto">
                           <a:xfrm>
                             <a:off x="0" y="0"/>
-                            <a:ext cx="836987" cy="1768472"/>
+                            <a:ext cx="1116000" cy="1512000"/>
                           </a:xfrm>
                           <a:prstGeom prst="rect">
                             <a:avLst/>
@@ -1634,7 +1634,7 @@
             <w:r>
               <w:drawing>
                 <wp:inline distT="0" distB="0" distL="0" distR="0">
-                  <wp:extent cx="593990" cy="593990"/>
+                  <wp:extent cx="792000" cy="792000"/>
                   <wp:effectExtent t="0" r="0" b="0" l="0"/>
                   <wp:docPr id="1" name="" descr="" title=""/>
                   <wp:cNvGraphicFramePr>
@@ -1659,7 +1659,7 @@
                         <pic:spPr bwMode="auto">
                           <a:xfrm>
                             <a:off x="0" y="0"/>
-                            <a:ext cx="593990" cy="593990"/>
+                            <a:ext cx="792000" cy="792000"/>
                           </a:xfrm>
                           <a:prstGeom prst="rect">
                             <a:avLst/>

</xml_diff>